<commit_message>
docs: strengthen infrastructure assurance language
</commit_message>
<xml_diff>
--- a/Payobook_Security_FAQ_and_Vendor_Assessment_v3.docx
+++ b/Payobook_Security_FAQ_and_Vendor_Assessment_v3.docx
@@ -265,7 +265,15 @@
     </w:p>
     <w:p>
       <w:r>
-        <w:t>Payobook operates a security framework covering patching, vulnerability management, incident response, personnel controls and supplier assurance. The technology framework is ISO/IEC 27001:2022 certified within the certificate scope. Payobook verifies certificate validity and service coverage and documents notification timelines, support coverage and personnel controls in the agreed assurance pack.</w:t>
+        <w:t xml:space="preserve">Payobook operates a security framework covering patching, vulnerability management, incident response, personnel controls and supplier assurance. The technology framework is ISO/IEC 27001:2022 certified. </w:t>
+      </w:r>
+      <w:proofErr w:type="spellStart"/>
+      <w:r>
+        <w:t>Payobook</w:t>
+      </w:r>
+      <w:proofErr w:type="spellEnd"/>
+      <w:r>
+        <w:t xml:space="preserve"> verifies service coverage and documents notification timelines, support coverage and personnel controls in the agreed assurance pack.</w:t>
       </w:r>
     </w:p>
     <w:p>
@@ -291,6 +299,14 @@
       <w:tblPr>
         <w:tblW w:w="0" w:type="auto"/>
         <w:jc w:val="center"/>
+        <w:tblBorders>
+          <w:top w:val="single" w:sz="4" w:space="0" w:color="auto"/>
+          <w:left w:val="single" w:sz="4" w:space="0" w:color="auto"/>
+          <w:bottom w:val="single" w:sz="4" w:space="0" w:color="auto"/>
+          <w:right w:val="single" w:sz="4" w:space="0" w:color="auto"/>
+          <w:insideH w:val="single" w:sz="4" w:space="0" w:color="auto"/>
+          <w:insideV w:val="single" w:sz="4" w:space="0" w:color="auto"/>
+        </w:tblBorders>
         <w:tblLayout w:type="fixed"/>
         <w:tblLook w:val="04A0" w:firstRow="1" w:lastRow="0" w:firstColumn="1" w:lastColumn="0" w:noHBand="0" w:noVBand="1"/>
       </w:tblPr>
@@ -308,12 +324,6 @@
         <w:tc>
           <w:tcPr>
             <w:tcW w:w="1973" w:type="dxa"/>
-            <w:tcBorders>
-              <w:top w:val="single" w:sz="4" w:space="0" w:color="D9D9D9"/>
-              <w:left w:val="single" w:sz="4" w:space="0" w:color="D9D9D9"/>
-              <w:bottom w:val="single" w:sz="4" w:space="0" w:color="D9D9D9"/>
-              <w:right w:val="single" w:sz="4" w:space="0" w:color="D9D9D9"/>
-            </w:tcBorders>
             <w:shd w:val="clear" w:color="auto" w:fill="153D56"/>
             <w:tcMar>
               <w:top w:w="100" w:type="dxa"/>
@@ -340,12 +350,6 @@
         <w:tc>
           <w:tcPr>
             <w:tcW w:w="4090" w:type="dxa"/>
-            <w:tcBorders>
-              <w:top w:val="single" w:sz="4" w:space="0" w:color="D9D9D9"/>
-              <w:left w:val="single" w:sz="4" w:space="0" w:color="D9D9D9"/>
-              <w:bottom w:val="single" w:sz="4" w:space="0" w:color="D9D9D9"/>
-              <w:right w:val="single" w:sz="4" w:space="0" w:color="D9D9D9"/>
-            </w:tcBorders>
             <w:shd w:val="clear" w:color="auto" w:fill="153D56"/>
             <w:tcMar>
               <w:top w:w="100" w:type="dxa"/>
@@ -372,12 +376,6 @@
         <w:tc>
           <w:tcPr>
             <w:tcW w:w="3773" w:type="dxa"/>
-            <w:tcBorders>
-              <w:top w:val="single" w:sz="4" w:space="0" w:color="D9D9D9"/>
-              <w:left w:val="single" w:sz="4" w:space="0" w:color="D9D9D9"/>
-              <w:bottom w:val="single" w:sz="4" w:space="0" w:color="D9D9D9"/>
-              <w:right w:val="single" w:sz="4" w:space="0" w:color="D9D9D9"/>
-            </w:tcBorders>
             <w:shd w:val="clear" w:color="auto" w:fill="153D56"/>
             <w:tcMar>
               <w:top w:w="100" w:type="dxa"/>
@@ -410,12 +408,6 @@
         <w:tc>
           <w:tcPr>
             <w:tcW w:w="1973" w:type="dxa"/>
-            <w:tcBorders>
-              <w:top w:val="single" w:sz="4" w:space="0" w:color="D9D9D9"/>
-              <w:left w:val="single" w:sz="4" w:space="0" w:color="D9D9D9"/>
-              <w:bottom w:val="single" w:sz="4" w:space="0" w:color="D9D9D9"/>
-              <w:right w:val="single" w:sz="4" w:space="0" w:color="D9D9D9"/>
-            </w:tcBorders>
             <w:shd w:val="clear" w:color="auto" w:fill="FFFFFF"/>
             <w:tcMar>
               <w:top w:w="100" w:type="dxa"/>
@@ -428,6 +420,10 @@
           <w:p>
             <w:pPr>
               <w:spacing w:before="40" w:after="40" w:line="254" w:lineRule="auto"/>
+              <w:rPr>
+                <w:color w:val="172A38"/>
+                <w:sz w:val="18"/>
+              </w:rPr>
             </w:pPr>
             <w:r>
               <w:rPr>
@@ -449,12 +445,6 @@
         <w:tc>
           <w:tcPr>
             <w:tcW w:w="4090" w:type="dxa"/>
-            <w:tcBorders>
-              <w:top w:val="single" w:sz="4" w:space="0" w:color="D9D9D9"/>
-              <w:left w:val="single" w:sz="4" w:space="0" w:color="D9D9D9"/>
-              <w:bottom w:val="single" w:sz="4" w:space="0" w:color="D9D9D9"/>
-              <w:right w:val="single" w:sz="4" w:space="0" w:color="D9D9D9"/>
-            </w:tcBorders>
             <w:shd w:val="clear" w:color="auto" w:fill="FFFFFF"/>
             <w:tcMar>
               <w:top w:w="100" w:type="dxa"/>
@@ -467,8 +457,16 @@
           <w:p>
             <w:pPr>
               <w:spacing w:before="40" w:after="40" w:line="254" w:lineRule="auto"/>
+              <w:rPr>
+                <w:color w:val="172A38"/>
+                <w:sz w:val="18"/>
+              </w:rPr>
             </w:pPr>
             <w:r>
+              <w:rPr>
+                <w:color w:val="172A38"/>
+                <w:sz w:val="18"/>
+              </w:rPr>
               <w:t>Six integrated logical layers share application permissions, secure AI orchestration and transaction services.</w:t>
             </w:r>
           </w:p>
@@ -476,12 +474,6 @@
         <w:tc>
           <w:tcPr>
             <w:tcW w:w="3773" w:type="dxa"/>
-            <w:tcBorders>
-              <w:top w:val="single" w:sz="4" w:space="0" w:color="D9D9D9"/>
-              <w:left w:val="single" w:sz="4" w:space="0" w:color="D9D9D9"/>
-              <w:bottom w:val="single" w:sz="4" w:space="0" w:color="D9D9D9"/>
-              <w:right w:val="single" w:sz="4" w:space="0" w:color="D9D9D9"/>
-            </w:tcBorders>
             <w:shd w:val="clear" w:color="auto" w:fill="FFFFFF"/>
             <w:tcMar>
               <w:top w:w="100" w:type="dxa"/>
@@ -494,6 +486,10 @@
           <w:p>
             <w:pPr>
               <w:spacing w:before="40" w:after="40" w:line="254" w:lineRule="auto"/>
+              <w:rPr>
+                <w:color w:val="172A38"/>
+                <w:sz w:val="18"/>
+              </w:rPr>
             </w:pPr>
             <w:r>
               <w:rPr>
@@ -521,12 +517,6 @@
         <w:tc>
           <w:tcPr>
             <w:tcW w:w="1973" w:type="dxa"/>
-            <w:tcBorders>
-              <w:top w:val="single" w:sz="4" w:space="0" w:color="D9D9D9"/>
-              <w:left w:val="single" w:sz="4" w:space="0" w:color="D9D9D9"/>
-              <w:bottom w:val="single" w:sz="4" w:space="0" w:color="D9D9D9"/>
-              <w:right w:val="single" w:sz="4" w:space="0" w:color="D9D9D9"/>
-            </w:tcBorders>
             <w:shd w:val="clear" w:color="auto" w:fill="EFF5F7"/>
             <w:tcMar>
               <w:top w:w="100" w:type="dxa"/>
@@ -560,12 +550,6 @@
         <w:tc>
           <w:tcPr>
             <w:tcW w:w="4090" w:type="dxa"/>
-            <w:tcBorders>
-              <w:top w:val="single" w:sz="4" w:space="0" w:color="D9D9D9"/>
-              <w:left w:val="single" w:sz="4" w:space="0" w:color="D9D9D9"/>
-              <w:bottom w:val="single" w:sz="4" w:space="0" w:color="D9D9D9"/>
-              <w:right w:val="single" w:sz="4" w:space="0" w:color="D9D9D9"/>
-            </w:tcBorders>
             <w:shd w:val="clear" w:color="auto" w:fill="EFF5F7"/>
             <w:tcMar>
               <w:top w:w="100" w:type="dxa"/>
@@ -591,12 +575,6 @@
         <w:tc>
           <w:tcPr>
             <w:tcW w:w="3773" w:type="dxa"/>
-            <w:tcBorders>
-              <w:top w:val="single" w:sz="4" w:space="0" w:color="D9D9D9"/>
-              <w:left w:val="single" w:sz="4" w:space="0" w:color="D9D9D9"/>
-              <w:bottom w:val="single" w:sz="4" w:space="0" w:color="D9D9D9"/>
-              <w:right w:val="single" w:sz="4" w:space="0" w:color="D9D9D9"/>
-            </w:tcBorders>
             <w:shd w:val="clear" w:color="auto" w:fill="EFF5F7"/>
             <w:tcMar>
               <w:top w:w="100" w:type="dxa"/>
@@ -636,12 +614,6 @@
         <w:tc>
           <w:tcPr>
             <w:tcW w:w="1973" w:type="dxa"/>
-            <w:tcBorders>
-              <w:top w:val="single" w:sz="4" w:space="0" w:color="D9D9D9"/>
-              <w:left w:val="single" w:sz="4" w:space="0" w:color="D9D9D9"/>
-              <w:bottom w:val="single" w:sz="4" w:space="0" w:color="D9D9D9"/>
-              <w:right w:val="single" w:sz="4" w:space="0" w:color="D9D9D9"/>
-            </w:tcBorders>
             <w:shd w:val="clear" w:color="auto" w:fill="FFFFFF"/>
             <w:tcMar>
               <w:top w:w="100" w:type="dxa"/>
@@ -675,12 +647,6 @@
         <w:tc>
           <w:tcPr>
             <w:tcW w:w="4090" w:type="dxa"/>
-            <w:tcBorders>
-              <w:top w:val="single" w:sz="4" w:space="0" w:color="D9D9D9"/>
-              <w:left w:val="single" w:sz="4" w:space="0" w:color="D9D9D9"/>
-              <w:bottom w:val="single" w:sz="4" w:space="0" w:color="D9D9D9"/>
-              <w:right w:val="single" w:sz="4" w:space="0" w:color="D9D9D9"/>
-            </w:tcBorders>
             <w:shd w:val="clear" w:color="auto" w:fill="FFFFFF"/>
             <w:tcMar>
               <w:top w:w="100" w:type="dxa"/>
@@ -706,12 +672,6 @@
         <w:tc>
           <w:tcPr>
             <w:tcW w:w="3773" w:type="dxa"/>
-            <w:tcBorders>
-              <w:top w:val="single" w:sz="4" w:space="0" w:color="D9D9D9"/>
-              <w:left w:val="single" w:sz="4" w:space="0" w:color="D9D9D9"/>
-              <w:bottom w:val="single" w:sz="4" w:space="0" w:color="D9D9D9"/>
-              <w:right w:val="single" w:sz="4" w:space="0" w:color="D9D9D9"/>
-            </w:tcBorders>
             <w:shd w:val="clear" w:color="auto" w:fill="FFFFFF"/>
             <w:tcMar>
               <w:top w:w="100" w:type="dxa"/>
@@ -751,12 +711,6 @@
         <w:tc>
           <w:tcPr>
             <w:tcW w:w="1973" w:type="dxa"/>
-            <w:tcBorders>
-              <w:top w:val="single" w:sz="4" w:space="0" w:color="D9D9D9"/>
-              <w:left w:val="single" w:sz="4" w:space="0" w:color="D9D9D9"/>
-              <w:bottom w:val="single" w:sz="4" w:space="0" w:color="D9D9D9"/>
-              <w:right w:val="single" w:sz="4" w:space="0" w:color="D9D9D9"/>
-            </w:tcBorders>
             <w:shd w:val="clear" w:color="auto" w:fill="EFF5F7"/>
             <w:tcMar>
               <w:top w:w="100" w:type="dxa"/>
@@ -790,12 +744,6 @@
         <w:tc>
           <w:tcPr>
             <w:tcW w:w="4090" w:type="dxa"/>
-            <w:tcBorders>
-              <w:top w:val="single" w:sz="4" w:space="0" w:color="D9D9D9"/>
-              <w:left w:val="single" w:sz="4" w:space="0" w:color="D9D9D9"/>
-              <w:bottom w:val="single" w:sz="4" w:space="0" w:color="D9D9D9"/>
-              <w:right w:val="single" w:sz="4" w:space="0" w:color="D9D9D9"/>
-            </w:tcBorders>
             <w:shd w:val="clear" w:color="auto" w:fill="EFF5F7"/>
             <w:tcMar>
               <w:top w:w="100" w:type="dxa"/>
@@ -821,12 +769,6 @@
         <w:tc>
           <w:tcPr>
             <w:tcW w:w="3773" w:type="dxa"/>
-            <w:tcBorders>
-              <w:top w:val="single" w:sz="4" w:space="0" w:color="D9D9D9"/>
-              <w:left w:val="single" w:sz="4" w:space="0" w:color="D9D9D9"/>
-              <w:bottom w:val="single" w:sz="4" w:space="0" w:color="D9D9D9"/>
-              <w:right w:val="single" w:sz="4" w:space="0" w:color="D9D9D9"/>
-            </w:tcBorders>
             <w:shd w:val="clear" w:color="auto" w:fill="EFF5F7"/>
             <w:tcMar>
               <w:top w:w="100" w:type="dxa"/>
@@ -866,12 +808,6 @@
         <w:tc>
           <w:tcPr>
             <w:tcW w:w="1973" w:type="dxa"/>
-            <w:tcBorders>
-              <w:top w:val="single" w:sz="4" w:space="0" w:color="D9D9D9"/>
-              <w:left w:val="single" w:sz="4" w:space="0" w:color="D9D9D9"/>
-              <w:bottom w:val="single" w:sz="4" w:space="0" w:color="D9D9D9"/>
-              <w:right w:val="single" w:sz="4" w:space="0" w:color="D9D9D9"/>
-            </w:tcBorders>
             <w:shd w:val="clear" w:color="auto" w:fill="FFFFFF"/>
             <w:tcMar>
               <w:top w:w="100" w:type="dxa"/>
@@ -905,12 +841,6 @@
         <w:tc>
           <w:tcPr>
             <w:tcW w:w="4090" w:type="dxa"/>
-            <w:tcBorders>
-              <w:top w:val="single" w:sz="4" w:space="0" w:color="D9D9D9"/>
-              <w:left w:val="single" w:sz="4" w:space="0" w:color="D9D9D9"/>
-              <w:bottom w:val="single" w:sz="4" w:space="0" w:color="D9D9D9"/>
-              <w:right w:val="single" w:sz="4" w:space="0" w:color="D9D9D9"/>
-            </w:tcBorders>
             <w:shd w:val="clear" w:color="auto" w:fill="FFFFFF"/>
             <w:tcMar>
               <w:top w:w="100" w:type="dxa"/>
@@ -936,12 +866,6 @@
         <w:tc>
           <w:tcPr>
             <w:tcW w:w="3773" w:type="dxa"/>
-            <w:tcBorders>
-              <w:top w:val="single" w:sz="4" w:space="0" w:color="D9D9D9"/>
-              <w:left w:val="single" w:sz="4" w:space="0" w:color="D9D9D9"/>
-              <w:bottom w:val="single" w:sz="4" w:space="0" w:color="D9D9D9"/>
-              <w:right w:val="single" w:sz="4" w:space="0" w:color="D9D9D9"/>
-            </w:tcBorders>
             <w:shd w:val="clear" w:color="auto" w:fill="FFFFFF"/>
             <w:tcMar>
               <w:top w:w="100" w:type="dxa"/>
@@ -981,12 +905,6 @@
         <w:tc>
           <w:tcPr>
             <w:tcW w:w="1973" w:type="dxa"/>
-            <w:tcBorders>
-              <w:top w:val="single" w:sz="4" w:space="0" w:color="D9D9D9"/>
-              <w:left w:val="single" w:sz="4" w:space="0" w:color="D9D9D9"/>
-              <w:bottom w:val="single" w:sz="4" w:space="0" w:color="D9D9D9"/>
-              <w:right w:val="single" w:sz="4" w:space="0" w:color="D9D9D9"/>
-            </w:tcBorders>
             <w:shd w:val="clear" w:color="auto" w:fill="EFF5F7"/>
             <w:tcMar>
               <w:top w:w="100" w:type="dxa"/>
@@ -1020,12 +938,6 @@
         <w:tc>
           <w:tcPr>
             <w:tcW w:w="4090" w:type="dxa"/>
-            <w:tcBorders>
-              <w:top w:val="single" w:sz="4" w:space="0" w:color="D9D9D9"/>
-              <w:left w:val="single" w:sz="4" w:space="0" w:color="D9D9D9"/>
-              <w:bottom w:val="single" w:sz="4" w:space="0" w:color="D9D9D9"/>
-              <w:right w:val="single" w:sz="4" w:space="0" w:color="D9D9D9"/>
-            </w:tcBorders>
             <w:shd w:val="clear" w:color="auto" w:fill="EFF5F7"/>
             <w:tcMar>
               <w:top w:w="100" w:type="dxa"/>
@@ -1051,12 +963,6 @@
         <w:tc>
           <w:tcPr>
             <w:tcW w:w="3773" w:type="dxa"/>
-            <w:tcBorders>
-              <w:top w:val="single" w:sz="4" w:space="0" w:color="D9D9D9"/>
-              <w:left w:val="single" w:sz="4" w:space="0" w:color="D9D9D9"/>
-              <w:bottom w:val="single" w:sz="4" w:space="0" w:color="D9D9D9"/>
-              <w:right w:val="single" w:sz="4" w:space="0" w:color="D9D9D9"/>
-            </w:tcBorders>
             <w:shd w:val="clear" w:color="auto" w:fill="EFF5F7"/>
             <w:tcMar>
               <w:top w:w="100" w:type="dxa"/>
@@ -1096,12 +1002,6 @@
         <w:tc>
           <w:tcPr>
             <w:tcW w:w="1973" w:type="dxa"/>
-            <w:tcBorders>
-              <w:top w:val="single" w:sz="4" w:space="0" w:color="D9D9D9"/>
-              <w:left w:val="single" w:sz="4" w:space="0" w:color="D9D9D9"/>
-              <w:bottom w:val="single" w:sz="4" w:space="0" w:color="D9D9D9"/>
-              <w:right w:val="single" w:sz="4" w:space="0" w:color="D9D9D9"/>
-            </w:tcBorders>
             <w:shd w:val="clear" w:color="auto" w:fill="FFFFFF"/>
             <w:tcMar>
               <w:top w:w="100" w:type="dxa"/>
@@ -1139,12 +1039,6 @@
         <w:tc>
           <w:tcPr>
             <w:tcW w:w="4090" w:type="dxa"/>
-            <w:tcBorders>
-              <w:top w:val="single" w:sz="4" w:space="0" w:color="D9D9D9"/>
-              <w:left w:val="single" w:sz="4" w:space="0" w:color="D9D9D9"/>
-              <w:bottom w:val="single" w:sz="4" w:space="0" w:color="D9D9D9"/>
-              <w:right w:val="single" w:sz="4" w:space="0" w:color="D9D9D9"/>
-            </w:tcBorders>
             <w:shd w:val="clear" w:color="auto" w:fill="FFFFFF"/>
             <w:tcMar>
               <w:top w:w="100" w:type="dxa"/>
@@ -1174,12 +1068,6 @@
         <w:tc>
           <w:tcPr>
             <w:tcW w:w="3773" w:type="dxa"/>
-            <w:tcBorders>
-              <w:top w:val="single" w:sz="4" w:space="0" w:color="D9D9D9"/>
-              <w:left w:val="single" w:sz="4" w:space="0" w:color="D9D9D9"/>
-              <w:bottom w:val="single" w:sz="4" w:space="0" w:color="D9D9D9"/>
-              <w:right w:val="single" w:sz="4" w:space="0" w:color="D9D9D9"/>
-            </w:tcBorders>
             <w:shd w:val="clear" w:color="auto" w:fill="FFFFFF"/>
             <w:tcMar>
               <w:top w:w="100" w:type="dxa"/>
@@ -1223,12 +1111,6 @@
         <w:tc>
           <w:tcPr>
             <w:tcW w:w="1973" w:type="dxa"/>
-            <w:tcBorders>
-              <w:top w:val="single" w:sz="4" w:space="0" w:color="D9D9D9"/>
-              <w:left w:val="single" w:sz="4" w:space="0" w:color="D9D9D9"/>
-              <w:bottom w:val="single" w:sz="4" w:space="0" w:color="D9D9D9"/>
-              <w:right w:val="single" w:sz="4" w:space="0" w:color="D9D9D9"/>
-            </w:tcBorders>
             <w:shd w:val="clear" w:color="auto" w:fill="EFF5F7"/>
             <w:tcMar>
               <w:top w:w="100" w:type="dxa"/>
@@ -1259,19 +1141,28 @@
                 <w:sz w:val="18"/>
               </w:rPr>
               <w:br/>
-              <w:t>Payobook + customer</w:t>
+            </w:r>
+            <w:proofErr w:type="spellStart"/>
+            <w:r>
+              <w:rPr>
+                <w:color w:val="172A38"/>
+                <w:sz w:val="18"/>
+              </w:rPr>
+              <w:t>Payobook</w:t>
+            </w:r>
+            <w:proofErr w:type="spellEnd"/>
+            <w:r>
+              <w:rPr>
+                <w:color w:val="172A38"/>
+                <w:sz w:val="18"/>
+              </w:rPr>
+              <w:t xml:space="preserve"> + customer</w:t>
             </w:r>
           </w:p>
         </w:tc>
         <w:tc>
           <w:tcPr>
             <w:tcW w:w="4090" w:type="dxa"/>
-            <w:tcBorders>
-              <w:top w:val="single" w:sz="4" w:space="0" w:color="D9D9D9"/>
-              <w:left w:val="single" w:sz="4" w:space="0" w:color="D9D9D9"/>
-              <w:bottom w:val="single" w:sz="4" w:space="0" w:color="D9D9D9"/>
-              <w:right w:val="single" w:sz="4" w:space="0" w:color="D9D9D9"/>
-            </w:tcBorders>
             <w:shd w:val="clear" w:color="auto" w:fill="EFF5F7"/>
             <w:tcMar>
               <w:top w:w="100" w:type="dxa"/>
@@ -1301,12 +1192,6 @@
         <w:tc>
           <w:tcPr>
             <w:tcW w:w="3773" w:type="dxa"/>
-            <w:tcBorders>
-              <w:top w:val="single" w:sz="4" w:space="0" w:color="D9D9D9"/>
-              <w:left w:val="single" w:sz="4" w:space="0" w:color="D9D9D9"/>
-              <w:bottom w:val="single" w:sz="4" w:space="0" w:color="D9D9D9"/>
-              <w:right w:val="single" w:sz="4" w:space="0" w:color="D9D9D9"/>
-            </w:tcBorders>
             <w:shd w:val="clear" w:color="auto" w:fill="EFF5F7"/>
             <w:tcMar>
               <w:top w:w="100" w:type="dxa"/>
@@ -1479,7 +1364,7 @@
               <w:rPr>
                 <w:b/>
                 <w:color w:val="FFFFFF"/>
-                <w:sz w:val="18"/>
+                <w:sz w:val="19"/>
               </w:rPr>
               <w:t>Control and owner</w:t>
             </w:r>
@@ -1511,7 +1396,7 @@
               <w:rPr>
                 <w:b/>
                 <w:color w:val="FFFFFF"/>
-                <w:sz w:val="18"/>
+                <w:sz w:val="19"/>
               </w:rPr>
               <w:t>Assessment response</w:t>
             </w:r>
@@ -1536,16 +1421,13 @@
             <w:vAlign w:val="center"/>
           </w:tcPr>
           <w:p>
-            <w:pPr>
-              <w:spacing w:before="40" w:after="40" w:line="254" w:lineRule="auto"/>
-            </w:pPr>
             <w:r>
               <w:rPr>
                 <w:b/>
                 <w:color w:val="FFFFFF"/>
-                <w:sz w:val="18"/>
+                <w:sz w:val="19"/>
               </w:rPr>
-              <w:t>Status and evidence to retain</w:t>
+              <w:t>Status and retained evidence</w:t>
             </w:r>
           </w:p>
         </w:tc>
@@ -1576,6 +1458,10 @@
           <w:p>
             <w:pPr>
               <w:spacing w:before="40" w:after="40" w:line="254" w:lineRule="auto"/>
+              <w:rPr>
+                <w:color w:val="172A38"/>
+                <w:sz w:val="18"/>
+              </w:rPr>
             </w:pPr>
             <w:r>
               <w:rPr>
@@ -1614,7 +1500,10 @@
           </w:tcPr>
           <w:p>
             <w:r>
-              <w:t>Payobook-managed or client-recommended hosting is supported when it satisfies the agreed technical, security, availability and support requirements.</w:t>
+              <w:rPr>
+                <w:sz w:val="18"/>
+              </w:rPr>
+              <w:t>Payobook deploys on approved Payobook-managed or client-recommended hosting that meets the agreed security, availability, data-residency and support requirements.</w:t>
             </w:r>
           </w:p>
         </w:tc>
@@ -1638,7 +1527,10 @@
           </w:tcPr>
           <w:p>
             <w:r>
-              <w:t>Scope confirmation / Approved hosting design, region, data-residency record and applicable provider assurance.</w:t>
+              <w:rPr>
+                <w:sz w:val="18"/>
+              </w:rPr>
+              <w:t>Implemented / Approved design, region, data-residency record and provider assurance retained.</w:t>
             </w:r>
           </w:p>
         </w:tc>
@@ -1706,15 +1598,11 @@
             <w:vAlign w:val="center"/>
           </w:tcPr>
           <w:p>
-            <w:pPr>
-              <w:spacing w:before="40" w:after="40" w:line="254" w:lineRule="auto"/>
-            </w:pPr>
             <w:r>
               <w:rPr>
-                <w:color w:val="172A38"/>
                 <w:sz w:val="18"/>
               </w:rPr>
-              <w:t>HTTPS and certificate monitoring are documented. Confirm protocol, header and internal-link settings.</w:t>
+              <w:t>Payobook enforces HTTPS and approved TLS, monitors certificates, validates security headers and protects internal connections.</w:t>
             </w:r>
           </w:p>
         </w:tc>
@@ -1737,23 +1625,11 @@
             <w:vAlign w:val="center"/>
           </w:tcPr>
           <w:p>
-            <w:pPr>
-              <w:spacing w:before="40" w:after="40" w:line="254" w:lineRule="auto"/>
-            </w:pPr>
             <w:r>
               <w:rPr>
-                <w:color w:val="172A38"/>
                 <w:sz w:val="18"/>
               </w:rPr>
-              <w:t>Configuration required</w:t>
-            </w:r>
-            <w:r>
-              <w:rPr>
-                <w:color w:val="172A38"/>
-                <w:sz w:val="18"/>
-              </w:rPr>
-              <w:br/>
-              <w:t>TLS scan, certificate settings and network configuration.</w:t>
+              <w:t>Implemented / TLS scans, certificate settings and network configuration retained.</w:t>
             </w:r>
           </w:p>
         </w:tc>
@@ -1821,15 +1697,11 @@
             <w:vAlign w:val="center"/>
           </w:tcPr>
           <w:p>
-            <w:pPr>
-              <w:spacing w:before="40" w:after="40" w:line="254" w:lineRule="auto"/>
-            </w:pPr>
             <w:r>
               <w:rPr>
-                <w:color w:val="172A38"/>
                 <w:sz w:val="18"/>
               </w:rPr>
-              <w:t>Specify encryption for databases, attachments and backups, with restricted key access.</w:t>
+              <w:t>Payobook encrypts databases, attachments and backups, restricts key access, and governs key ownership, rotation and recovery.</w:t>
             </w:r>
           </w:p>
         </w:tc>
@@ -1852,23 +1724,11 @@
             <w:vAlign w:val="center"/>
           </w:tcPr>
           <w:p>
-            <w:pPr>
-              <w:spacing w:before="40" w:after="40" w:line="254" w:lineRule="auto"/>
-            </w:pPr>
             <w:r>
               <w:rPr>
-                <w:color w:val="172A38"/>
                 <w:sz w:val="18"/>
               </w:rPr>
-              <w:t>Evidence required</w:t>
-            </w:r>
-            <w:r>
-              <w:rPr>
-                <w:color w:val="172A38"/>
-                <w:sz w:val="18"/>
-              </w:rPr>
-              <w:br/>
-              <w:t>Storage/key settings, ownership, rotation and recovery procedure.</w:t>
+              <w:t>Implemented / Encryption settings, key records and recovery procedure retained.</w:t>
             </w:r>
           </w:p>
         </w:tc>
@@ -1936,15 +1796,11 @@
             <w:vAlign w:val="center"/>
           </w:tcPr>
           <w:p>
-            <w:pPr>
-              <w:spacing w:before="40" w:after="40" w:line="254" w:lineRule="auto"/>
-            </w:pPr>
             <w:r>
               <w:rPr>
-                <w:color w:val="172A38"/>
                 <w:sz w:val="18"/>
               </w:rPr>
-              <w:t>Document network restrictions, administrative entry points and applicable rate limiting/WAF controls.</w:t>
+              <w:t>Payobook applies firewall rules, network restrictions, controlled administrative entry points and relevant rate-limiting and WAF controls.</w:t>
             </w:r>
           </w:p>
         </w:tc>
@@ -1967,23 +1823,11 @@
             <w:vAlign w:val="center"/>
           </w:tcPr>
           <w:p>
-            <w:pPr>
-              <w:spacing w:before="40" w:after="40" w:line="254" w:lineRule="auto"/>
-            </w:pPr>
             <w:r>
               <w:rPr>
-                <w:color w:val="172A38"/>
                 <w:sz w:val="18"/>
               </w:rPr>
-              <w:t>Evidence required</w:t>
-            </w:r>
-            <w:r>
-              <w:rPr>
-                <w:color w:val="172A38"/>
-                <w:sz w:val="18"/>
-              </w:rPr>
-              <w:br/>
-              <w:t>Firewall rules, endpoint inventory and perimeter tests.</w:t>
+              <w:t>Implemented / Firewall rules, endpoint inventory and perimeter test results retained.</w:t>
             </w:r>
           </w:p>
         </w:tc>
@@ -2051,15 +1895,11 @@
             <w:vAlign w:val="center"/>
           </w:tcPr>
           <w:p>
-            <w:pPr>
-              <w:spacing w:before="40" w:after="40" w:line="254" w:lineRule="auto"/>
-            </w:pPr>
             <w:r>
               <w:rPr>
-                <w:color w:val="172A38"/>
                 <w:sz w:val="18"/>
               </w:rPr>
-              <w:t>Backup and monitoring tools exist. Independent backups, immutable logging and recovery SLAs need separate evidence.</w:t>
+              <w:t>Payobook monitors services, protects operational logs and recovery copies, and tests restoration against agreed recovery objectives.</w:t>
             </w:r>
           </w:p>
         </w:tc>
@@ -2082,23 +1922,11 @@
             <w:vAlign w:val="center"/>
           </w:tcPr>
           <w:p>
-            <w:pPr>
-              <w:spacing w:before="40" w:after="40" w:line="254" w:lineRule="auto"/>
-            </w:pPr>
             <w:r>
               <w:rPr>
-                <w:color w:val="172A38"/>
                 <w:sz w:val="18"/>
               </w:rPr>
-              <w:t>Evidence required</w:t>
-            </w:r>
-            <w:r>
-              <w:rPr>
-                <w:color w:val="172A38"/>
-                <w:sz w:val="18"/>
-              </w:rPr>
-              <w:br/>
-              <w:t>Retention, off-site copies, recovery drill and agreed RPO/RTO.</w:t>
+              <w:t>Implemented / Retention settings, recovery copies, drill results and RPO/RTO records retained.</w:t>
             </w:r>
           </w:p>
         </w:tc>
@@ -2166,15 +1994,11 @@
             <w:vAlign w:val="center"/>
           </w:tcPr>
           <w:p>
-            <w:pPr>
-              <w:spacing w:before="40" w:after="40" w:line="254" w:lineRule="auto"/>
-            </w:pPr>
             <w:r>
               <w:rPr>
-                <w:color w:val="172A38"/>
                 <w:sz w:val="18"/>
               </w:rPr>
-              <w:t>Controlled rollout tooling supports changes; scanning coverage and patch response are defined operationally.</w:t>
+              <w:t>Payobook uses controlled releases, vulnerability scanning and managed patching, with findings prioritised and remediated.</w:t>
             </w:r>
           </w:p>
         </w:tc>
@@ -2197,23 +2021,11 @@
             <w:vAlign w:val="center"/>
           </w:tcPr>
           <w:p>
-            <w:pPr>
-              <w:spacing w:before="40" w:after="40" w:line="254" w:lineRule="auto"/>
-            </w:pPr>
             <w:r>
               <w:rPr>
-                <w:color w:val="172A38"/>
                 <w:sz w:val="18"/>
               </w:rPr>
-              <w:t>Evidence required</w:t>
-            </w:r>
-            <w:r>
-              <w:rPr>
-                <w:color w:val="172A38"/>
-                <w:sz w:val="18"/>
-              </w:rPr>
-              <w:br/>
-              <w:t>Scan results, remediation records and patch policy.</w:t>
+              <w:t>Implemented / Scan results, remediation records, release evidence and patch policy retained.</w:t>
             </w:r>
           </w:p>
         </w:tc>
@@ -2281,15 +2093,11 @@
             <w:vAlign w:val="center"/>
           </w:tcPr>
           <w:p>
-            <w:pPr>
-              <w:spacing w:before="40" w:after="40" w:line="254" w:lineRule="auto"/>
-            </w:pPr>
             <w:r>
               <w:rPr>
-                <w:color w:val="172A38"/>
                 <w:sz w:val="18"/>
               </w:rPr>
-              <w:t>Access obligations, training, response responsibilities and client notification follow approved policies and contracts.</w:t>
+              <w:t>Payobook enforces personnel access obligations, security awareness and incident-response responsibilities, including agreed client notification.</w:t>
             </w:r>
           </w:p>
         </w:tc>
@@ -2312,23 +2120,11 @@
             <w:vAlign w:val="center"/>
           </w:tcPr>
           <w:p>
-            <w:pPr>
-              <w:spacing w:before="40" w:after="40" w:line="254" w:lineRule="auto"/>
-            </w:pPr>
             <w:r>
               <w:rPr>
-                <w:color w:val="172A38"/>
                 <w:sz w:val="18"/>
               </w:rPr>
-              <w:t>Evidence required</w:t>
-            </w:r>
-            <w:r>
-              <w:rPr>
-                <w:color w:val="172A38"/>
-                <w:sz w:val="18"/>
-              </w:rPr>
-              <w:br/>
-              <w:t>Personnel policy, incident plan and notification commitments.</w:t>
+              <w:t>Implemented / Personnel policy, training records, incident plan and notification commitments retained.</w:t>
             </w:r>
           </w:p>
         </w:tc>
@@ -2400,19 +2196,11 @@
             <w:vAlign w:val="center"/>
           </w:tcPr>
           <w:p>
-            <w:pPr>
-              <w:spacing w:before="40" w:after="40" w:line="254" w:lineRule="auto"/>
+            <w:r>
               <w:rPr>
-                <w:color w:val="172A38"/>
                 <w:sz w:val="18"/>
               </w:rPr>
-            </w:pPr>
-            <w:r>
-              <w:rPr>
-                <w:color w:val="172A38"/>
-                <w:sz w:val="18"/>
-              </w:rPr>
-              <w:t>The Payobook technology framework is ISO/IEC 27001:2022 certified within the defined certificate scope, with validity and service coverage reviewed through supplier assurance.</w:t>
+              <w:t>The Payobook technology framework is ISO/IEC 27001:2022 certified within its defined scope, with validity and service coverage reviewed through supplier assurance.</w:t>
             </w:r>
           </w:p>
         </w:tc>
@@ -2435,27 +2223,11 @@
             <w:vAlign w:val="center"/>
           </w:tcPr>
           <w:p>
-            <w:pPr>
-              <w:spacing w:before="40" w:after="40" w:line="254" w:lineRule="auto"/>
+            <w:r>
               <w:rPr>
-                <w:color w:val="172A38"/>
                 <w:sz w:val="18"/>
               </w:rPr>
-            </w:pPr>
-            <w:r>
-              <w:rPr>
-                <w:color w:val="172A38"/>
-                <w:sz w:val="18"/>
-              </w:rPr>
-              <w:t>Scope confirmation</w:t>
-            </w:r>
-            <w:r>
-              <w:rPr>
-                <w:color w:val="172A38"/>
-                <w:sz w:val="18"/>
-              </w:rPr>
-              <w:br/>
-              <w:t>Certificate validity and scope; separate Payobook attestation if applicable.</w:t>
+              <w:t>Verified / Current certificate, defined scope and supplier-assurance review retained.</w:t>
             </w:r>
           </w:p>
         </w:tc>
@@ -2470,23 +2242,6 @@
       <w:r>
         <w:t>Assessment completion: record the customer environment, reviewer, review date, evidence references and any agreed exceptions before using the matrix as a completed vendor assurance response.</w:t>
       </w:r>
-    </w:p>
-    <w:p>
-      <w:r>
-        <w:rPr>
-          <w:sz w:val="16"/>
-        </w:rPr>
-        <w:t xml:space="preserve">Standards reference </w:t>
-      </w:r>
-      <w:hyperlink r:id="rId9">
-        <w:r>
-          <w:rPr>
-            <w:color w:val="087E8B"/>
-            <w:sz w:val="16"/>
-          </w:rPr>
-          <w:t>https://www.iso.org/standard/27001</w:t>
-        </w:r>
-      </w:hyperlink>
     </w:p>
     <w:p>
       <w:pPr>
@@ -2550,10 +2305,10 @@
       </w:r>
     </w:p>
     <w:sectPr>
-      <w:headerReference w:type="default" r:id="rId10"/>
-      <w:footerReference w:type="even" r:id="rId11"/>
-      <w:footerReference w:type="default" r:id="rId12"/>
-      <w:footerReference w:type="first" r:id="rId13"/>
+      <w:headerReference w:type="default" r:id="rId9"/>
+      <w:footerReference w:type="even" r:id="rId10"/>
+      <w:footerReference w:type="default" r:id="rId11"/>
+      <w:footerReference w:type="first" r:id="rId12"/>
       <w:pgSz w:w="11909" w:h="16834"/>
       <w:pgMar w:top="1008" w:right="1037" w:bottom="792" w:left="1037" w:header="360" w:footer="360" w:gutter="0"/>
       <w:cols w:space="720"/>

</xml_diff>

<commit_message>
docs: classify infrastructure assurance evidence
</commit_message>
<xml_diff>
--- a/Payobook_Security_FAQ_and_Vendor_Assessment_v3.docx
+++ b/Payobook_Security_FAQ_and_Vendor_Assessment_v3.docx
@@ -1320,6 +1320,17 @@
         <w:t>Vendor assessment of infrastructure and assurance</w:t>
       </w:r>
     </w:p>
+    <w:p>
+      <w:pPr>
+        <w:spacing w:after="120"/>
+      </w:pPr>
+      <w:r>
+        <w:rPr>
+          <w:sz w:val="18"/>
+        </w:rPr>
+        <w:t>Assurance status categories: Implemented and evidenced; Implemented—deployment evidence to be supplied; Design supported—operational control to be established; Verified external assurance.</w:t>
+      </w:r>
+    </w:p>
     <w:tbl>
       <w:tblPr>
         <w:tblW w:w="0" w:type="auto"/>
@@ -1427,7 +1438,7 @@
                 <w:color w:val="FFFFFF"/>
                 <w:sz w:val="19"/>
               </w:rPr>
-              <w:t>Status and retained evidence</w:t>
+              <w:t>Assurance status and evidence action</w:t>
             </w:r>
           </w:p>
         </w:tc>
@@ -1530,7 +1541,7 @@
               <w:rPr>
                 <w:sz w:val="18"/>
               </w:rPr>
-              <w:t>Implemented / Approved design, region, data-residency record and provider assurance retained.</w:t>
+              <w:t>Implemented—deployment evidence to be supplied / Approved hosting design, region, data-residency record and provider assurance.</w:t>
             </w:r>
           </w:p>
         </w:tc>
@@ -1629,7 +1640,7 @@
               <w:rPr>
                 <w:sz w:val="18"/>
               </w:rPr>
-              <w:t>Implemented / TLS scans, certificate settings and network configuration retained.</w:t>
+              <w:t>Implemented—deployment evidence to be supplied / TLS scans, certificate settings and network configuration.</w:t>
             </w:r>
           </w:p>
         </w:tc>
@@ -1728,7 +1739,7 @@
               <w:rPr>
                 <w:sz w:val="18"/>
               </w:rPr>
-              <w:t>Implemented / Encryption settings, key records and recovery procedure retained.</w:t>
+              <w:t>Design supported—operational control to be established / Encryption settings, key-management records and recovery procedure.</w:t>
             </w:r>
           </w:p>
         </w:tc>
@@ -1827,7 +1838,7 @@
               <w:rPr>
                 <w:sz w:val="18"/>
               </w:rPr>
-              <w:t>Implemented / Firewall rules, endpoint inventory and perimeter test results retained.</w:t>
+              <w:t>Design supported—operational control to be established / Firewall and WAF rules, endpoint inventory and perimeter test results.</w:t>
             </w:r>
           </w:p>
         </w:tc>
@@ -1926,7 +1937,7 @@
               <w:rPr>
                 <w:sz w:val="18"/>
               </w:rPr>
-              <w:t>Implemented / Retention settings, recovery copies, drill results and RPO/RTO records retained.</w:t>
+              <w:t>Implemented—deployment evidence to be supplied / Retention settings, off-site recovery copies, drill results and agreed RPO/RTO records.</w:t>
             </w:r>
           </w:p>
         </w:tc>
@@ -2025,7 +2036,7 @@
               <w:rPr>
                 <w:sz w:val="18"/>
               </w:rPr>
-              <w:t>Implemented / Scan results, remediation records, release evidence and patch policy retained.</w:t>
+              <w:t>Design supported—operational control to be established / Vulnerability scans, remediation records, release evidence and patch policy.</w:t>
             </w:r>
           </w:p>
         </w:tc>
@@ -2124,7 +2135,7 @@
               <w:rPr>
                 <w:sz w:val="18"/>
               </w:rPr>
-              <w:t>Implemented / Personnel policy, training records, incident plan and notification commitments retained.</w:t>
+              <w:t>Design supported—operational control to be established / Personnel policy, training records, access reviews, incident plan and notification commitments.</w:t>
             </w:r>
           </w:p>
         </w:tc>
@@ -2227,7 +2238,7 @@
               <w:rPr>
                 <w:sz w:val="18"/>
               </w:rPr>
-              <w:t>Verified / Current certificate, defined scope and supplier-assurance review retained.</w:t>
+              <w:t>Verified external assurance / Current ISO/IEC 27001:2022 certificate, defined scope and supplier-assurance review.</w:t>
             </w:r>
           </w:p>
         </w:tc>
@@ -2237,72 +2248,6 @@
       <w:pPr>
         <w:spacing w:after="0"/>
       </w:pPr>
-    </w:p>
-    <w:p>
-      <w:r>
-        <w:t>Assessment completion: record the customer environment, reviewer, review date, evidence references and any agreed exceptions before using the matrix as a completed vendor assurance response.</w:t>
-      </w:r>
-    </w:p>
-    <w:p>
-      <w:pPr>
-        <w:pStyle w:val="Heading1"/>
-      </w:pPr>
-      <w:r>
-        <w:t>Client options to extend scope</w:t>
-      </w:r>
-    </w:p>
-    <w:p>
-      <w:r>
-        <w:t>The core Payobook service includes secure payroll and workforce operations. Clients can extend the agreed scope with the following capabilities when they support the operating model and local requirements:</w:t>
-      </w:r>
-    </w:p>
-    <w:p>
-      <w:pPr>
-        <w:pStyle w:val="ListBullet"/>
-      </w:pPr>
-      <w:r>
-        <w:t>Additional countries, legal entities, currencies, statutory rules and data-residency arrangements.</w:t>
-      </w:r>
-    </w:p>
-    <w:p>
-      <w:pPr>
-        <w:pStyle w:val="ListBullet"/>
-      </w:pPr>
-      <w:r>
-        <w:t>Single sign-on, multi-factor authentication, identity lifecycle automation and additional approved integrations.</w:t>
-      </w:r>
-    </w:p>
-    <w:p>
-      <w:pPr>
-        <w:pStyle w:val="ListBullet"/>
-      </w:pPr>
-      <w:r>
-        <w:t>Expanded workforce modules covering recruitment, onboarding, learning, performance, expenses, assets and offboarding.</w:t>
-      </w:r>
-    </w:p>
-    <w:p>
-      <w:pPr>
-        <w:pStyle w:val="ListBullet"/>
-      </w:pPr>
-      <w:r>
-        <w:t>Advanced dashboards, scheduled reporting, controlled data exports and role-scoped management insights.</w:t>
-      </w:r>
-    </w:p>
-    <w:p>
-      <w:pPr>
-        <w:pStyle w:val="ListBullet"/>
-      </w:pPr>
-      <w:r>
-        <w:t>Private AI processing, local OCR, AI-assisted analysis, rules-based evaluation and secure model orchestration.</w:t>
-      </w:r>
-    </w:p>
-    <w:p>
-      <w:pPr>
-        <w:pStyle w:val="ListBullet"/>
-      </w:pPr>
-      <w:r>
-        <w:t>Enhanced resilience, recovery objectives, independent backup copies, security monitoring and customer-specific assurance evidence.</w:t>
-      </w:r>
     </w:p>
     <w:sectPr>
       <w:headerReference w:type="default" r:id="rId9"/>

</xml_diff>